<commit_message>
fix: watermark and DOCX companion
- Rebuild the watermark on eso-pic: the text is resized to 90% of
  the page width and rotated 45 degrees, so any text length spans
  the same width and always fits inside the page. Fixes the
  inverted scale that made DRAFT invisible, and the inconsistent
  per-page watermarks (earlier pages carried the package default)
- The watermark is set before any page ships, so every page
  carries the same marking
- DOCX: classification banner paragraph (ClassificationBanner
  style) plus a DOCPROPERTY field in the header that reads the
  front-matter classification at render time; review-overdue
  warnings now render in DOCX too
- Example relies on draft: true for the DRAFT watermark instead of
  the conflicting explicit watermark
</commit_message>
<xml_diff>
--- a/_extensions/obsidian/obsidian-reference.docx
+++ b/_extensions/obsidian/obsidian-reference.docx
@@ -495,7 +495,7 @@
 </w:footnotes>
 </file>
 
-<file path=word/header1.xml><?xml version="1.0" encoding="utf-8"?>
+<file path=word/header1.xml><?xml version="1.0" encoding="UTF-8" standalone="yes"?>
 <w:hdr xmlns:w="http://schemas.openxmlformats.org/wordprocessingml/2006/main">
   <w:p>
     <w:pPr>
@@ -520,10 +520,21 @@
         <w:szCs w:val="16"/>
         <w:color w:val="484949"/>
       </w:rPr>
-      <w:t xml:space="preserve"> | Commercial in Confidence</w:t>
+      <w:fldSimple w:instr=" DOCPROPERTY  \"classification\" \* MERGEFORMAT " w:dirty="true">
+        <w:r>
+          <w:rPr>
+            <w:rFonts w:ascii="Montserrat" w:eastAsia="Montserrat" w:hAnsi="Montserrat"/>
+            <w:sz w:val="16"/>
+            <w:szCs w:val="16"/>
+            <w:color w:val="484949"/>
+          </w:rPr>
+          <w:t>Commercial in Confidence</w:t>
+        </w:r>
+      </w:fldSimple>
     </w:r>
   </w:p>
 </w:hdr>
+
 </file>
 
 <file path=word/numbering.xml><?xml version="1.0" encoding="utf-8"?>
@@ -1324,6 +1335,23 @@
     <w:semiHidden/>
     <w:unhideWhenUsed/>
     <w:qFormat/>
+  </w:style>
+  <w:style w:type="paragraph" w:styleId="ClassificationBanner">
+    <w:name w:val="ClassificationBanner"/>
+    <w:basedOn w:val="Normal"/>
+    <w:uiPriority w:val="98"/>
+    <w:qFormat/>
+    <w:pPr>
+      <w:shd w:val="clear" w:color="auto" w:fill="F3F3F3"/>
+      <w:spacing w:after="240"/>
+    </w:pPr>
+    <w:rPr>
+      <w:rFonts w:ascii="Montserrat" w:eastAsia="Montserrat" w:hAnsi="Montserrat"/>
+      <w:sz w:val="20"/>
+      <w:szCs w:val="20"/>
+      <w:color w:val="121212"/>
+      <w:b/>
+    </w:rPr>
   </w:style>
 </w:styles>
 </file>

</xml_diff>

<commit_message>
fix: watermark, DOCX companion, cleanup (#5)
* fix: watermark and DOCX companion

- Rebuild the watermark on eso-pic: the text is resized to 90% of
  the page width and rotated 45 degrees, so any text length spans
  the same width and always fits inside the page. Fixes the
  inverted scale that made DRAFT invisible, and the inconsistent
  per-page watermarks (earlier pages carried the package default)
- The watermark is set before any page ships, so every page
  carries the same marking
- DOCX: classification banner paragraph (ClassificationBanner
  style) plus a DOCPROPERTY field in the header that reads the
  front-matter classification at render time; review-overdue
  warnings now render in DOCX too
- Example relies on draft: true for the DRAFT watermark instead of
  the conflicting explicit watermark

* chore: ignore render debris and LibreOffice locks

- Ignore wm-* debug images, wm-hard.* test leftovers, and
  LibreOffice .~lock.*# files
</commit_message>
<xml_diff>
--- a/_extensions/obsidian/obsidian-reference.docx
+++ b/_extensions/obsidian/obsidian-reference.docx
@@ -495,7 +495,7 @@
 </w:footnotes>
 </file>
 
-<file path=word/header1.xml><?xml version="1.0" encoding="utf-8"?>
+<file path=word/header1.xml><?xml version="1.0" encoding="UTF-8" standalone="yes"?>
 <w:hdr xmlns:w="http://schemas.openxmlformats.org/wordprocessingml/2006/main">
   <w:p>
     <w:pPr>
@@ -520,10 +520,21 @@
         <w:szCs w:val="16"/>
         <w:color w:val="484949"/>
       </w:rPr>
-      <w:t xml:space="preserve"> | Commercial in Confidence</w:t>
+      <w:fldSimple w:instr=" DOCPROPERTY  \"classification\" \* MERGEFORMAT " w:dirty="true">
+        <w:r>
+          <w:rPr>
+            <w:rFonts w:ascii="Montserrat" w:eastAsia="Montserrat" w:hAnsi="Montserrat"/>
+            <w:sz w:val="16"/>
+            <w:szCs w:val="16"/>
+            <w:color w:val="484949"/>
+          </w:rPr>
+          <w:t>Commercial in Confidence</w:t>
+        </w:r>
+      </w:fldSimple>
     </w:r>
   </w:p>
 </w:hdr>
+
 </file>
 
 <file path=word/numbering.xml><?xml version="1.0" encoding="utf-8"?>
@@ -1324,6 +1335,23 @@
     <w:semiHidden/>
     <w:unhideWhenUsed/>
     <w:qFormat/>
+  </w:style>
+  <w:style w:type="paragraph" w:styleId="ClassificationBanner">
+    <w:name w:val="ClassificationBanner"/>
+    <w:basedOn w:val="Normal"/>
+    <w:uiPriority w:val="98"/>
+    <w:qFormat/>
+    <w:pPr>
+      <w:shd w:val="clear" w:color="auto" w:fill="F3F3F3"/>
+      <w:spacing w:after="240"/>
+    </w:pPr>
+    <w:rPr>
+      <w:rFonts w:ascii="Montserrat" w:eastAsia="Montserrat" w:hAnsi="Montserrat"/>
+      <w:sz w:val="20"/>
+      <w:szCs w:val="20"/>
+      <w:color w:val="121212"/>
+      <w:b/>
+    </w:rPr>
   </w:style>
 </w:styles>
 </file>

</xml_diff>

<commit_message>
feat: add pptx format and VML DOCX watermark
- pptx format: reference-deck with the classification marking in
  the footer placeholders, copied to every slide via the p:hf
  mechanism; Montserrat theme fonts on the near-black palette
- DOCX watermark: replace the DrawingML header text box (which
  LibreOffice does not render) with the classic VML textpath
  watermark that Word generates for Insert > Watermark
- Fix the reference header XML escaping (literal backslashes broke
  the DOCPROPERTY field for strict parsers)
- classification.lua records watermark-text metadata for the DOCX
  header field
</commit_message>
<xml_diff>
--- a/_extensions/obsidian/obsidian-reference.docx
+++ b/_extensions/obsidian/obsidian-reference.docx
@@ -314,10 +314,7 @@
       </w:r>
     </w:p>
     <w:sectPr>
-      <w:headerReference xmlns:r="http://schemas.openxmlformats.org/officeDocument/2006/relationships" w:type="default" r:id="rId50"/>
-      <w:footerReference xmlns:r="http://schemas.openxmlformats.org/officeDocument/2006/relationships" w:type="default" r:id="rId51"/>
-      <w:pgSz w:w="11906" w:h="16838"/>
-      <w:pgMar w:top="1417" w:right="1417" w:bottom="1417" w:left="1417" w:header="708" w:footer="708" w:gutter="0"/>
+      <w:headerReference xmlns:r="http://schemas.openxmlformats.org/officeDocument/2006/relationships" w:type="default" r:id="rIdHeader1"/>
       <w:footnotePr>
         <w:numRestart w:val="eachSect"/>
       </w:footnotePr>
@@ -330,128 +327,6 @@
 <w:comments xmlns:w="http://schemas.openxmlformats.org/wordprocessingml/2006/main" xmlns:m="http://schemas.openxmlformats.org/officeDocument/2006/math" xmlns:r="http://schemas.openxmlformats.org/officeDocument/2006/relationships" xmlns:o="urn:schemas-microsoft-com:office:office" xmlns:v="urn:schemas-microsoft-com:vml" xmlns:w10="urn:schemas-microsoft-com:office:word" xmlns:a="http://schemas.openxmlformats.org/drawingml/2006/main" xmlns:pic="http://schemas.openxmlformats.org/drawingml/2006/picture" xmlns:wp="http://schemas.openxmlformats.org/drawingml/2006/wordprocessingDrawing"/>
 </file>
 
-<file path=word/footer1.xml><?xml version="1.0" encoding="utf-8"?>
-<w:ftr xmlns:w="http://schemas.openxmlformats.org/wordprocessingml/2006/main" xmlns:v="urn:schemas-microsoft-com:vml">
-  <w:p>
-    <w:pPr>
-      <w:pStyle w:val="Footer"/>
-      <w:pBdr>
-        <w:top w:val="single" w:sz="4" w:space="1" w:color="CECECE"/>
-      </w:pBdr>
-      <w:jc w:val="center"/>
-    </w:pPr>
-    <w:r>
-      <w:rPr>
-        <w:rFonts w:ascii="Palatino Linotype" w:eastAsia="Palatino Linotype" w:hAnsi="Palatino Linotype"/>
-        <w:sz w:val="18"/>
-        <w:szCs w:val="18"/>
-        <w:color w:val="484949"/>
-      </w:rPr>
-      <w:fldChar w:fldCharType="begin"/>
-    </w:r>
-    <w:r>
-      <w:rPr>
-        <w:rFonts w:ascii="Palatino Linotype" w:eastAsia="Palatino Linotype" w:hAnsi="Palatino Linotype"/>
-        <w:sz w:val="18"/>
-        <w:szCs w:val="18"/>
-        <w:color w:val="484949"/>
-      </w:rPr>
-      <w:instrText xml:space="preserve"> PAGE </w:instrText>
-    </w:r>
-    <w:r>
-      <w:rPr>
-        <w:rFonts w:ascii="Palatino Linotype" w:eastAsia="Palatino Linotype" w:hAnsi="Palatino Linotype"/>
-        <w:sz w:val="18"/>
-        <w:szCs w:val="18"/>
-        <w:color w:val="484949"/>
-      </w:rPr>
-      <w:fldChar w:fldCharType="separate"/>
-    </w:r>
-    <w:r>
-      <w:rPr>
-        <w:rFonts w:ascii="Palatino Linotype" w:eastAsia="Palatino Linotype" w:hAnsi="Palatino Linotype"/>
-        <w:sz w:val="18"/>
-        <w:szCs w:val="18"/>
-        <w:color w:val="484949"/>
-      </w:rPr>
-      <w:t>1</w:t>
-    </w:r>
-    <w:r>
-      <w:rPr>
-        <w:rFonts w:ascii="Palatino Linotype" w:eastAsia="Palatino Linotype" w:hAnsi="Palatino Linotype"/>
-        <w:sz w:val="18"/>
-        <w:szCs w:val="18"/>
-        <w:color w:val="484949"/>
-      </w:rPr>
-      <w:fldChar w:fldCharType="end"/>
-    </w:r>
-    <w:r>
-      <w:rPr>
-        <w:rFonts w:ascii="Palatino Linotype" w:eastAsia="Palatino Linotype" w:hAnsi="Palatino Linotype"/>
-        <w:sz w:val="18"/>
-        <w:szCs w:val="18"/>
-        <w:color w:val="484949"/>
-      </w:rPr>
-      <w:t xml:space="preserve"> / </w:t>
-    </w:r>
-    <w:r>
-      <w:rPr>
-        <w:rFonts w:ascii="Palatino Linotype" w:eastAsia="Palatino Linotype" w:hAnsi="Palatino Linotype"/>
-        <w:sz w:val="18"/>
-        <w:szCs w:val="18"/>
-        <w:color w:val="484949"/>
-      </w:rPr>
-      <w:fldChar w:fldCharType="begin"/>
-    </w:r>
-    <w:r>
-      <w:rPr>
-        <w:rFonts w:ascii="Palatino Linotype" w:eastAsia="Palatino Linotype" w:hAnsi="Palatino Linotype"/>
-        <w:sz w:val="18"/>
-        <w:szCs w:val="18"/>
-        <w:color w:val="484949"/>
-      </w:rPr>
-      <w:instrText xml:space="preserve"> NUMPAGES </w:instrText>
-    </w:r>
-    <w:r>
-      <w:rPr>
-        <w:rFonts w:ascii="Palatino Linotype" w:eastAsia="Palatino Linotype" w:hAnsi="Palatino Linotype"/>
-        <w:sz w:val="18"/>
-        <w:szCs w:val="18"/>
-        <w:color w:val="484949"/>
-      </w:rPr>
-      <w:fldChar w:fldCharType="separate"/>
-    </w:r>
-    <w:r>
-      <w:rPr>
-        <w:rFonts w:ascii="Palatino Linotype" w:eastAsia="Palatino Linotype" w:hAnsi="Palatino Linotype"/>
-        <w:sz w:val="18"/>
-        <w:szCs w:val="18"/>
-        <w:color w:val="484949"/>
-      </w:rPr>
-      <w:t>1</w:t>
-    </w:r>
-    <w:r>
-      <w:rPr>
-        <w:rFonts w:ascii="Palatino Linotype" w:eastAsia="Palatino Linotype" w:hAnsi="Palatino Linotype"/>
-        <w:sz w:val="18"/>
-        <w:szCs w:val="18"/>
-        <w:color w:val="484949"/>
-      </w:rPr>
-      <w:fldChar w:fldCharType="end"/>
-    </w:r>
-    <w:r>
-      <w:rPr>
-        <w:rFonts w:ascii="Palatino Linotype" w:eastAsia="Palatino Linotype" w:hAnsi="Palatino Linotype"/>
-        <w:sz w:val="18"/>
-        <w:szCs w:val="18"/>
-        <w:color w:val="484949"/>
-      </w:rPr>
-      <w:t xml:space="preserve">  Obsidian Solutions | obsidiansolutions.co.uk</w:t>
-    </w:r>
-  </w:p>
-</w:ftr>
-</file>
-
 <file path=word/footnotes.xml><?xml version="1.0" encoding="utf-8"?>
 <w:footnotes xmlns:w="http://schemas.openxmlformats.org/wordprocessingml/2006/main" xmlns:m="http://schemas.openxmlformats.org/officeDocument/2006/math" xmlns:r="http://schemas.openxmlformats.org/officeDocument/2006/relationships" xmlns:o="urn:schemas-microsoft-com:office:office" xmlns:v="urn:schemas-microsoft-com:vml" xmlns:w10="urn:schemas-microsoft-com:office:word" xmlns:a="http://schemas.openxmlformats.org/drawingml/2006/main" xmlns:pic="http://schemas.openxmlformats.org/drawingml/2006/picture" xmlns:wp="http://schemas.openxmlformats.org/drawingml/2006/wordprocessingDrawing">
   <w:footnote w:type="continuationSeparator" w:id="0">
@@ -495,37 +370,31 @@
 </w:footnotes>
 </file>
 
-<file path=word/header1.xml><?xml version="1.0" encoding="UTF-8" standalone="yes"?>
-<w:hdr xmlns:w="http://schemas.openxmlformats.org/wordprocessingml/2006/main">
+<file path=word/header1.xml><?xml version="1.0" encoding="utf-8"?>
+<w:hdr xmlns:w="http://schemas.openxmlformats.org/wordprocessingml/2006/main" xmlns:v="urn:schemas-microsoft-com:vml" xmlns:o="urn:schemas-microsoft-com:office:office">
   <w:p>
     <w:pPr>
       <w:pStyle w:val="Header"/>
-      <w:pBdr>
-        <w:bottom w:val="single" w:sz="4" w:space="1" w:color="CECECE"/>
-      </w:pBdr>
     </w:pPr>
     <w:r>
       <w:rPr>
-        <w:rFonts w:ascii="Montserrat" w:eastAsia="Montserrat" w:hAnsi="Montserrat"/>
+        <w:rFonts w:ascii="Montserrat" w:hAnsi="Montserrat"/>
         <w:sz w:val="16"/>
-        <w:szCs w:val="16"/>
         <w:color w:val="484949"/>
       </w:rPr>
-      <w:t xml:space="preserve">Obsidian Solutions</w:t>
+      <w:t xml:space="preserve">Obsidian Solutions | </w:t>
     </w:r>
     <w:r>
       <w:rPr>
-        <w:rFonts w:ascii="Montserrat" w:eastAsia="Montserrat" w:hAnsi="Montserrat"/>
+        <w:rFonts w:ascii="Montserrat" w:hAnsi="Montserrat"/>
         <w:sz w:val="16"/>
-        <w:szCs w:val="16"/>
         <w:color w:val="484949"/>
       </w:rPr>
-      <w:fldSimple w:instr=" DOCPROPERTY  \"classification\" \* MERGEFORMAT " w:dirty="true">
+      <w:fldSimple w:instr=" DOCPROPERTY  &quot;classification&quot; \* MERGEFORMAT " w:dirty="true">
         <w:r>
           <w:rPr>
-            <w:rFonts w:ascii="Montserrat" w:eastAsia="Montserrat" w:hAnsi="Montserrat"/>
+            <w:rFonts w:ascii="Montserrat" w:hAnsi="Montserrat"/>
             <w:sz w:val="16"/>
-            <w:szCs w:val="16"/>
             <w:color w:val="484949"/>
           </w:rPr>
           <w:t>Commercial in Confidence</w:t>
@@ -533,8 +402,20 @@
       </w:fldSimple>
     </w:r>
   </w:p>
+  <w:p>
+    <w:pPr>
+      <w:pStyle w:val="Header"/>
+    </w:pPr>
+    <w:r>
+      <w:pict>
+        <v:shape id="PowerPlusWaterMarkObject" o:spid="_x0000_s1025" type="#_x0000_t136" style="position:absolute;margin-left:0;margin-top:0;width:467.75pt;height:229.8pt;z-index:-251654144;mso-wrap-edited:f;rotation:315;mso-position-horizontal:center;mso-position-horizontal-relative:margin;mso-position-vertical:center;mso-position-vertical-relative:margin" o:allowincell="f" fillcolor="#ececec" stroked="f">
+          <v:fill opacity=".5"/>
+          <v:textpath style="font-family:&quot;Montserrat&quot;;font-size:1pt" string="Commercial in Confidence"/>
+        </v:shape>
+      </w:pict>
+    </w:r>
+  </w:p>
 </w:hdr>
-
 </file>
 
 <file path=word/numbering.xml><?xml version="1.0" encoding="utf-8"?>
@@ -669,15 +550,6 @@
   <w:style w:type="paragraph" w:default="1" w:styleId="Normal">
     <w:name w:val="Normal"/>
     <w:qFormat/>
-    <w:pPr>
-      <w:spacing w:after="120" w:line="276" w:lineRule="auto"/>
-    </w:pPr>
-    <w:rPr>
-      <w:rFonts w:ascii="Palatino Linotype" w:eastAsia="Palatino Linotype" w:hAnsi="Palatino Linotype"/>
-      <w:sz w:val="22"/>
-      <w:szCs w:val="22"/>
-      <w:color w:val="121212"/>
-    </w:rPr>
   </w:style>
   <w:style w:type="paragraph" w:styleId="BodyText">
     <w:name w:val="Body Text"/>
@@ -851,7 +723,7 @@
     </w:pPr>
     <w:rPr>
       <w:rFonts w:asciiTheme="majorHAnsi" w:eastAsiaTheme="majorEastAsia" w:hAnsiTheme="majorHAnsi" w:cstheme="majorBidi"/>
-      <w:color w:val="121212"/>
+      <w:color w:val="0F4761" w:themeColor="accent1" w:themeShade="BF"/>
       <w:sz w:val="40"/>
       <w:szCs w:val="40"/>
     </w:rPr>
@@ -874,7 +746,7 @@
     </w:pPr>
     <w:rPr>
       <w:rFonts w:asciiTheme="majorHAnsi" w:eastAsiaTheme="majorEastAsia" w:hAnsiTheme="majorHAnsi" w:cstheme="majorBidi"/>
-      <w:color w:val="121212"/>
+      <w:color w:val="0F4761" w:themeColor="accent1" w:themeShade="BF"/>
       <w:sz w:val="32"/>
       <w:szCs w:val="32"/>
     </w:rPr>
@@ -897,7 +769,7 @@
     </w:pPr>
     <w:rPr>
       <w:rFonts w:eastAsiaTheme="majorEastAsia" w:cstheme="majorBidi"/>
-      <w:color w:val="121212"/>
+      <w:color w:val="0F4761" w:themeColor="accent1" w:themeShade="BF"/>
       <w:sz w:val="28"/>
       <w:szCs w:val="28"/>
     </w:rPr>
@@ -1197,23 +1069,18 @@
     <w:unhideWhenUsed/>
     <w:qFormat/>
     <w:tblPr>
-      <w:tblW w:w="0" w:type="auto"/>
-      <w:tblBorders>
-        <w:top w:val="single" w:sz="8" w:space="0" w:color="121212"/>
-        <w:bottom w:val="single" w:sz="8" w:space="0" w:color="121212"/>
-        <w:insideH w:val="single" w:sz="4" w:space="0" w:color="CECECE"/>
-      </w:tblBorders>
+      <w:tblInd w:w="0" w:type="dxa"/>
       <w:tblCellMar>
-        <w:top w:w="60" w:type="dxa"/>
+        <w:top w:w="0" w:type="dxa"/>
         <w:left w:w="108" w:type="dxa"/>
-        <w:bottom w:w="60" w:type="dxa"/>
+        <w:bottom w:w="0" w:type="dxa"/>
         <w:right w:w="108" w:type="dxa"/>
       </w:tblCellMar>
     </w:tblPr>
     <w:tblStylePr w:type="firstRow">
       <w:tcPr>
         <w:tcBorders>
-          <w:bottom w:val="single" w:sz="4" w:space="0" w:color="121212"/>
+          <w:bottom w:val="single"/>
         </w:tcBorders>
         <w:vAlign w:val="bottom"/>
       </w:tcPr>
@@ -1244,9 +1111,7 @@
       <w:spacing w:before="0" w:after="120"/>
     </w:pPr>
     <w:rPr>
-      <w:color w:val="484949"/>
-      <w:sz w:val="18"/>
-      <w:szCs w:val="18"/>
+      <w:i/>
     </w:rPr>
   </w:style>
   <w:style w:type="paragraph" w:customStyle="1" w:styleId="TableCaption">
@@ -1299,7 +1164,7 @@
     <w:name w:val="Hyperlink"/>
     <w:basedOn w:val="BodyTextChar"/>
     <w:rPr>
-      <w:color w:val="484949"/>
+      <w:color w:val="4F81BD" w:themeColor="accent1"/>
     </w:rPr>
   </w:style>
   <w:style w:type="paragraph" w:styleId="TOCHeading">
@@ -1318,39 +1183,6 @@
       <w:b w:val="0"/>
       <w:bCs w:val="0"/>
       <w:color w:val="365F91" w:themeColor="accent1" w:themeShade="BF"/>
-    </w:rPr>
-  </w:style>
-  <w:style w:type="paragraph" w:styleId="Header">
-    <w:name w:val="header"/>
-    <w:basedOn w:val="Normal"/>
-    <w:uiPriority w:val="99"/>
-    <w:semiHidden/>
-    <w:unhideWhenUsed/>
-    <w:qFormat/>
-  </w:style>
-  <w:style w:type="paragraph" w:styleId="Footer">
-    <w:name w:val="footer"/>
-    <w:basedOn w:val="Normal"/>
-    <w:uiPriority w:val="99"/>
-    <w:semiHidden/>
-    <w:unhideWhenUsed/>
-    <w:qFormat/>
-  </w:style>
-  <w:style w:type="paragraph" w:styleId="ClassificationBanner">
-    <w:name w:val="ClassificationBanner"/>
-    <w:basedOn w:val="Normal"/>
-    <w:uiPriority w:val="98"/>
-    <w:qFormat/>
-    <w:pPr>
-      <w:shd w:val="clear" w:color="auto" w:fill="F3F3F3"/>
-      <w:spacing w:after="240"/>
-    </w:pPr>
-    <w:rPr>
-      <w:rFonts w:ascii="Montserrat" w:eastAsia="Montserrat" w:hAnsi="Montserrat"/>
-      <w:sz w:val="20"/>
-      <w:szCs w:val="20"/>
-      <w:color w:val="121212"/>
-      <w:b/>
     </w:rPr>
   </w:style>
 </w:styles>
@@ -1399,7 +1231,7 @@
     </a:clrScheme>
     <a:fontScheme name="Office">
       <a:majorFont>
-        <a:latin typeface="Montserrat" panose="02030603090505050204"/>
+        <a:latin typeface="Aptos Display" panose="02110004020202020204"/>
         <a:ea typeface=""/>
         <a:cs typeface=""/>
         <a:font script="Jpan" typeface="游ゴシック Light"/>
@@ -1451,7 +1283,7 @@
         <a:font script="Tfng" typeface="Ebrima"/>
       </a:majorFont>
       <a:minorFont>
-        <a:latin typeface="Palatino Linotype" panose="02030603090505050204"/>
+        <a:latin typeface="Aptos" panose="02110004020202020204"/>
         <a:ea typeface=""/>
         <a:cs typeface=""/>
         <a:font script="Jpan" typeface="游明朝"/>

</xml_diff>

<commit_message>
fix: house-styled DOCX reference with VML watermark
Restore the full house style (Palatino body, Montserrat headings,
monochrome palette, ClassificationBanner) in the reference and apply
the VML watermark + corrected DOCPROPERTY escaping on top. The
earlier rebuild started from the pandoc default and dropped the
house styling.
</commit_message>
<xml_diff>
--- a/_extensions/obsidian/obsidian-reference.docx
+++ b/_extensions/obsidian/obsidian-reference.docx
@@ -314,7 +314,10 @@
       </w:r>
     </w:p>
     <w:sectPr>
-      <w:headerReference xmlns:r="http://schemas.openxmlformats.org/officeDocument/2006/relationships" w:type="default" r:id="rIdHeader1"/>
+      <w:headerReference xmlns:r="http://schemas.openxmlformats.org/officeDocument/2006/relationships" w:type="default" r:id="rId50"/>
+      <w:footerReference xmlns:r="http://schemas.openxmlformats.org/officeDocument/2006/relationships" w:type="default" r:id="rId51"/>
+      <w:pgSz w:w="11906" w:h="16838"/>
+      <w:pgMar w:top="1417" w:right="1417" w:bottom="1417" w:left="1417" w:header="708" w:footer="708" w:gutter="0"/>
       <w:footnotePr>
         <w:numRestart w:val="eachSect"/>
       </w:footnotePr>
@@ -327,6 +330,128 @@
 <w:comments xmlns:w="http://schemas.openxmlformats.org/wordprocessingml/2006/main" xmlns:m="http://schemas.openxmlformats.org/officeDocument/2006/math" xmlns:r="http://schemas.openxmlformats.org/officeDocument/2006/relationships" xmlns:o="urn:schemas-microsoft-com:office:office" xmlns:v="urn:schemas-microsoft-com:vml" xmlns:w10="urn:schemas-microsoft-com:office:word" xmlns:a="http://schemas.openxmlformats.org/drawingml/2006/main" xmlns:pic="http://schemas.openxmlformats.org/drawingml/2006/picture" xmlns:wp="http://schemas.openxmlformats.org/drawingml/2006/wordprocessingDrawing"/>
 </file>
 
+<file path=word/footer1.xml><?xml version="1.0" encoding="utf-8"?>
+<w:ftr xmlns:w="http://schemas.openxmlformats.org/wordprocessingml/2006/main" xmlns:v="urn:schemas-microsoft-com:vml">
+  <w:p>
+    <w:pPr>
+      <w:pStyle w:val="Footer"/>
+      <w:pBdr>
+        <w:top w:val="single" w:sz="4" w:space="1" w:color="CECECE"/>
+      </w:pBdr>
+      <w:jc w:val="center"/>
+    </w:pPr>
+    <w:r>
+      <w:rPr>
+        <w:rFonts w:ascii="Palatino Linotype" w:eastAsia="Palatino Linotype" w:hAnsi="Palatino Linotype"/>
+        <w:sz w:val="18"/>
+        <w:szCs w:val="18"/>
+        <w:color w:val="484949"/>
+      </w:rPr>
+      <w:fldChar w:fldCharType="begin"/>
+    </w:r>
+    <w:r>
+      <w:rPr>
+        <w:rFonts w:ascii="Palatino Linotype" w:eastAsia="Palatino Linotype" w:hAnsi="Palatino Linotype"/>
+        <w:sz w:val="18"/>
+        <w:szCs w:val="18"/>
+        <w:color w:val="484949"/>
+      </w:rPr>
+      <w:instrText xml:space="preserve"> PAGE </w:instrText>
+    </w:r>
+    <w:r>
+      <w:rPr>
+        <w:rFonts w:ascii="Palatino Linotype" w:eastAsia="Palatino Linotype" w:hAnsi="Palatino Linotype"/>
+        <w:sz w:val="18"/>
+        <w:szCs w:val="18"/>
+        <w:color w:val="484949"/>
+      </w:rPr>
+      <w:fldChar w:fldCharType="separate"/>
+    </w:r>
+    <w:r>
+      <w:rPr>
+        <w:rFonts w:ascii="Palatino Linotype" w:eastAsia="Palatino Linotype" w:hAnsi="Palatino Linotype"/>
+        <w:sz w:val="18"/>
+        <w:szCs w:val="18"/>
+        <w:color w:val="484949"/>
+      </w:rPr>
+      <w:t>1</w:t>
+    </w:r>
+    <w:r>
+      <w:rPr>
+        <w:rFonts w:ascii="Palatino Linotype" w:eastAsia="Palatino Linotype" w:hAnsi="Palatino Linotype"/>
+        <w:sz w:val="18"/>
+        <w:szCs w:val="18"/>
+        <w:color w:val="484949"/>
+      </w:rPr>
+      <w:fldChar w:fldCharType="end"/>
+    </w:r>
+    <w:r>
+      <w:rPr>
+        <w:rFonts w:ascii="Palatino Linotype" w:eastAsia="Palatino Linotype" w:hAnsi="Palatino Linotype"/>
+        <w:sz w:val="18"/>
+        <w:szCs w:val="18"/>
+        <w:color w:val="484949"/>
+      </w:rPr>
+      <w:t xml:space="preserve"> / </w:t>
+    </w:r>
+    <w:r>
+      <w:rPr>
+        <w:rFonts w:ascii="Palatino Linotype" w:eastAsia="Palatino Linotype" w:hAnsi="Palatino Linotype"/>
+        <w:sz w:val="18"/>
+        <w:szCs w:val="18"/>
+        <w:color w:val="484949"/>
+      </w:rPr>
+      <w:fldChar w:fldCharType="begin"/>
+    </w:r>
+    <w:r>
+      <w:rPr>
+        <w:rFonts w:ascii="Palatino Linotype" w:eastAsia="Palatino Linotype" w:hAnsi="Palatino Linotype"/>
+        <w:sz w:val="18"/>
+        <w:szCs w:val="18"/>
+        <w:color w:val="484949"/>
+      </w:rPr>
+      <w:instrText xml:space="preserve"> NUMPAGES </w:instrText>
+    </w:r>
+    <w:r>
+      <w:rPr>
+        <w:rFonts w:ascii="Palatino Linotype" w:eastAsia="Palatino Linotype" w:hAnsi="Palatino Linotype"/>
+        <w:sz w:val="18"/>
+        <w:szCs w:val="18"/>
+        <w:color w:val="484949"/>
+      </w:rPr>
+      <w:fldChar w:fldCharType="separate"/>
+    </w:r>
+    <w:r>
+      <w:rPr>
+        <w:rFonts w:ascii="Palatino Linotype" w:eastAsia="Palatino Linotype" w:hAnsi="Palatino Linotype"/>
+        <w:sz w:val="18"/>
+        <w:szCs w:val="18"/>
+        <w:color w:val="484949"/>
+      </w:rPr>
+      <w:t>1</w:t>
+    </w:r>
+    <w:r>
+      <w:rPr>
+        <w:rFonts w:ascii="Palatino Linotype" w:eastAsia="Palatino Linotype" w:hAnsi="Palatino Linotype"/>
+        <w:sz w:val="18"/>
+        <w:szCs w:val="18"/>
+        <w:color w:val="484949"/>
+      </w:rPr>
+      <w:fldChar w:fldCharType="end"/>
+    </w:r>
+    <w:r>
+      <w:rPr>
+        <w:rFonts w:ascii="Palatino Linotype" w:eastAsia="Palatino Linotype" w:hAnsi="Palatino Linotype"/>
+        <w:sz w:val="18"/>
+        <w:szCs w:val="18"/>
+        <w:color w:val="484949"/>
+      </w:rPr>
+      <w:t xml:space="preserve">  Obsidian Solutions | obsidiansolutions.co.uk</w:t>
+    </w:r>
+  </w:p>
+</w:ftr>
+</file>
+
 <file path=word/footnotes.xml><?xml version="1.0" encoding="utf-8"?>
 <w:footnotes xmlns:w="http://schemas.openxmlformats.org/wordprocessingml/2006/main" xmlns:m="http://schemas.openxmlformats.org/officeDocument/2006/math" xmlns:r="http://schemas.openxmlformats.org/officeDocument/2006/relationships" xmlns:o="urn:schemas-microsoft-com:office:office" xmlns:v="urn:schemas-microsoft-com:vml" xmlns:w10="urn:schemas-microsoft-com:office:word" xmlns:a="http://schemas.openxmlformats.org/drawingml/2006/main" xmlns:pic="http://schemas.openxmlformats.org/drawingml/2006/picture" xmlns:wp="http://schemas.openxmlformats.org/drawingml/2006/wordprocessingDrawing">
   <w:footnote w:type="continuationSeparator" w:id="0">
@@ -371,30 +496,36 @@
 </file>
 
 <file path=word/header1.xml><?xml version="1.0" encoding="utf-8"?>
-<w:hdr xmlns:w="http://schemas.openxmlformats.org/wordprocessingml/2006/main" xmlns:v="urn:schemas-microsoft-com:vml" xmlns:o="urn:schemas-microsoft-com:office:office">
+<w:hdr xmlns:v="urn:schemas-microsoft-com:vml" xmlns:o="urn:schemas-microsoft-com:office:office" xmlns:w="http://schemas.openxmlformats.org/wordprocessingml/2006/main">
   <w:p>
     <w:pPr>
       <w:pStyle w:val="Header"/>
+      <w:pBdr>
+        <w:bottom w:val="single" w:sz="4" w:space="1" w:color="CECECE"/>
+      </w:pBdr>
     </w:pPr>
     <w:r>
       <w:rPr>
-        <w:rFonts w:ascii="Montserrat" w:hAnsi="Montserrat"/>
+        <w:rFonts w:ascii="Montserrat" w:eastAsia="Montserrat" w:hAnsi="Montserrat"/>
         <w:sz w:val="16"/>
+        <w:szCs w:val="16"/>
         <w:color w:val="484949"/>
       </w:rPr>
-      <w:t xml:space="preserve">Obsidian Solutions | </w:t>
+      <w:t xml:space="preserve">Obsidian Solutions</w:t>
     </w:r>
     <w:r>
       <w:rPr>
-        <w:rFonts w:ascii="Montserrat" w:hAnsi="Montserrat"/>
+        <w:rFonts w:ascii="Montserrat" w:eastAsia="Montserrat" w:hAnsi="Montserrat"/>
         <w:sz w:val="16"/>
+        <w:szCs w:val="16"/>
         <w:color w:val="484949"/>
       </w:rPr>
       <w:fldSimple w:instr=" DOCPROPERTY  &quot;classification&quot; \* MERGEFORMAT " w:dirty="true">
         <w:r>
           <w:rPr>
-            <w:rFonts w:ascii="Montserrat" w:hAnsi="Montserrat"/>
+            <w:rFonts w:ascii="Montserrat" w:eastAsia="Montserrat" w:hAnsi="Montserrat"/>
             <w:sz w:val="16"/>
+            <w:szCs w:val="16"/>
             <w:color w:val="484949"/>
           </w:rPr>
           <w:t>Commercial in Confidence</w:t>
@@ -550,6 +681,15 @@
   <w:style w:type="paragraph" w:default="1" w:styleId="Normal">
     <w:name w:val="Normal"/>
     <w:qFormat/>
+    <w:pPr>
+      <w:spacing w:after="120" w:line="276" w:lineRule="auto"/>
+    </w:pPr>
+    <w:rPr>
+      <w:rFonts w:ascii="Palatino Linotype" w:eastAsia="Palatino Linotype" w:hAnsi="Palatino Linotype"/>
+      <w:sz w:val="22"/>
+      <w:szCs w:val="22"/>
+      <w:color w:val="121212"/>
+    </w:rPr>
   </w:style>
   <w:style w:type="paragraph" w:styleId="BodyText">
     <w:name w:val="Body Text"/>
@@ -723,7 +863,7 @@
     </w:pPr>
     <w:rPr>
       <w:rFonts w:asciiTheme="majorHAnsi" w:eastAsiaTheme="majorEastAsia" w:hAnsiTheme="majorHAnsi" w:cstheme="majorBidi"/>
-      <w:color w:val="0F4761" w:themeColor="accent1" w:themeShade="BF"/>
+      <w:color w:val="121212"/>
       <w:sz w:val="40"/>
       <w:szCs w:val="40"/>
     </w:rPr>
@@ -746,7 +886,7 @@
     </w:pPr>
     <w:rPr>
       <w:rFonts w:asciiTheme="majorHAnsi" w:eastAsiaTheme="majorEastAsia" w:hAnsiTheme="majorHAnsi" w:cstheme="majorBidi"/>
-      <w:color w:val="0F4761" w:themeColor="accent1" w:themeShade="BF"/>
+      <w:color w:val="121212"/>
       <w:sz w:val="32"/>
       <w:szCs w:val="32"/>
     </w:rPr>
@@ -769,7 +909,7 @@
     </w:pPr>
     <w:rPr>
       <w:rFonts w:eastAsiaTheme="majorEastAsia" w:cstheme="majorBidi"/>
-      <w:color w:val="0F4761" w:themeColor="accent1" w:themeShade="BF"/>
+      <w:color w:val="121212"/>
       <w:sz w:val="28"/>
       <w:szCs w:val="28"/>
     </w:rPr>
@@ -1069,18 +1209,23 @@
     <w:unhideWhenUsed/>
     <w:qFormat/>
     <w:tblPr>
-      <w:tblInd w:w="0" w:type="dxa"/>
+      <w:tblW w:w="0" w:type="auto"/>
+      <w:tblBorders>
+        <w:top w:val="single" w:sz="8" w:space="0" w:color="121212"/>
+        <w:bottom w:val="single" w:sz="8" w:space="0" w:color="121212"/>
+        <w:insideH w:val="single" w:sz="4" w:space="0" w:color="CECECE"/>
+      </w:tblBorders>
       <w:tblCellMar>
-        <w:top w:w="0" w:type="dxa"/>
+        <w:top w:w="60" w:type="dxa"/>
         <w:left w:w="108" w:type="dxa"/>
-        <w:bottom w:w="0" w:type="dxa"/>
+        <w:bottom w:w="60" w:type="dxa"/>
         <w:right w:w="108" w:type="dxa"/>
       </w:tblCellMar>
     </w:tblPr>
     <w:tblStylePr w:type="firstRow">
       <w:tcPr>
         <w:tcBorders>
-          <w:bottom w:val="single"/>
+          <w:bottom w:val="single" w:sz="4" w:space="0" w:color="121212"/>
         </w:tcBorders>
         <w:vAlign w:val="bottom"/>
       </w:tcPr>
@@ -1111,7 +1256,9 @@
       <w:spacing w:before="0" w:after="120"/>
     </w:pPr>
     <w:rPr>
-      <w:i/>
+      <w:color w:val="484949"/>
+      <w:sz w:val="18"/>
+      <w:szCs w:val="18"/>
     </w:rPr>
   </w:style>
   <w:style w:type="paragraph" w:customStyle="1" w:styleId="TableCaption">
@@ -1164,7 +1311,7 @@
     <w:name w:val="Hyperlink"/>
     <w:basedOn w:val="BodyTextChar"/>
     <w:rPr>
-      <w:color w:val="4F81BD" w:themeColor="accent1"/>
+      <w:color w:val="484949"/>
     </w:rPr>
   </w:style>
   <w:style w:type="paragraph" w:styleId="TOCHeading">
@@ -1183,6 +1330,39 @@
       <w:b w:val="0"/>
       <w:bCs w:val="0"/>
       <w:color w:val="365F91" w:themeColor="accent1" w:themeShade="BF"/>
+    </w:rPr>
+  </w:style>
+  <w:style w:type="paragraph" w:styleId="Header">
+    <w:name w:val="header"/>
+    <w:basedOn w:val="Normal"/>
+    <w:uiPriority w:val="99"/>
+    <w:semiHidden/>
+    <w:unhideWhenUsed/>
+    <w:qFormat/>
+  </w:style>
+  <w:style w:type="paragraph" w:styleId="Footer">
+    <w:name w:val="footer"/>
+    <w:basedOn w:val="Normal"/>
+    <w:uiPriority w:val="99"/>
+    <w:semiHidden/>
+    <w:unhideWhenUsed/>
+    <w:qFormat/>
+  </w:style>
+  <w:style w:type="paragraph" w:styleId="ClassificationBanner">
+    <w:name w:val="ClassificationBanner"/>
+    <w:basedOn w:val="Normal"/>
+    <w:uiPriority w:val="98"/>
+    <w:qFormat/>
+    <w:pPr>
+      <w:shd w:val="clear" w:color="auto" w:fill="F3F3F3"/>
+      <w:spacing w:after="240"/>
+    </w:pPr>
+    <w:rPr>
+      <w:rFonts w:ascii="Montserrat" w:eastAsia="Montserrat" w:hAnsi="Montserrat"/>
+      <w:sz w:val="20"/>
+      <w:szCs w:val="20"/>
+      <w:color w:val="121212"/>
+      <w:b/>
     </w:rPr>
   </w:style>
 </w:styles>
@@ -1231,7 +1411,7 @@
     </a:clrScheme>
     <a:fontScheme name="Office">
       <a:majorFont>
-        <a:latin typeface="Aptos Display" panose="02110004020202020204"/>
+        <a:latin typeface="Montserrat" panose="02030603090505050204"/>
         <a:ea typeface=""/>
         <a:cs typeface=""/>
         <a:font script="Jpan" typeface="游ゴシック Light"/>
@@ -1283,7 +1463,7 @@
         <a:font script="Tfng" typeface="Ebrima"/>
       </a:majorFont>
       <a:minorFont>
-        <a:latin typeface="Aptos" panose="02110004020202020204"/>
+        <a:latin typeface="Palatino Linotype" panose="02030603090505050204"/>
         <a:ea typeface=""/>
         <a:cs typeface=""/>
         <a:font script="Jpan" typeface="游明朝"/>

</xml_diff>

<commit_message>
feat: brand every output format with the house logo
- html: enable the native title-block banner and render the brand
  mark at its top-left (embedded data URI, so the theme is
  self-contained; positioned absolutely to escape Quarto's banner
  grid). The dark theme hides the dark-on-transparent mark, which
  would vanish on the raised surface; the favicon still brands the
  tab
- revealjs: native logo: bottom-right on every slide
- beamer: native logo: top-right on the title slide
- dashboard: native logo: left in the navigation bar
- docx: add the brand mark to the reference-doc header, left of
  the company name (word/media + drawing + rels + content types)
- verified: logos render in all five formats (visual QA on html
  and docx, xobject check on the beamer PDF, markup checks on
  revealjs and dashboard); classification footline still on every
  beamer slide; LaTeX and Typst regressions pass PDF/A-4f
</commit_message>
<xml_diff>
--- a/_extensions/obsidian/obsidian-reference.docx
+++ b/_extensions/obsidian/obsidian-reference.docx
@@ -496,7 +496,7 @@
 </file>
 
 <file path=word/header1.xml><?xml version="1.0" encoding="utf-8"?>
-<w:hdr xmlns:v="urn:schemas-microsoft-com:vml" xmlns:o="urn:schemas-microsoft-com:office:office" xmlns:w="http://schemas.openxmlformats.org/wordprocessingml/2006/main">
+<w:hdr xmlns:v="urn:schemas-microsoft-com:vml" xmlns:o="urn:schemas-microsoft-com:office:office" xmlns:w="http://schemas.openxmlformats.org/wordprocessingml/2006/main" xmlns:r="http://schemas.openxmlformats.org/officeDocument/2006/relationships" xmlns:wp="http://schemas.openxmlformats.org/drawingml/2006/wordprocessingDrawing" xmlns:a="http://schemas.openxmlformats.org/drawingml/2006/main" xmlns:pic="http://schemas.openxmlformats.org/drawingml/2006/picture">
   <w:p>
     <w:pPr>
       <w:pStyle w:val="Header"/>
@@ -504,6 +504,43 @@
         <w:bottom w:val="single" w:sz="4" w:space="1" w:color="CECECE"/>
       </w:pBdr>
     </w:pPr>
+    <w:r>
+      <w:drawing>
+        <wp:inline distT="0" distB="0" distL="0" distR="0">
+          <wp:extent cx="570090" cy="170228"/>
+          <wp:effectExtent l="0" t="0" r="0" b="0"/>
+          <wp:docPr id="100" name="obsidian-logo.png"/>
+          <wp:cNvGraphicFramePr>
+            <a:graphicFrameLocks xmlns:a="http://schemas.openxmlformats.org/drawingml/2006/main" noChangeAspect="1"/>
+          </wp:cNvGraphicFramePr>
+          <a:graphic xmlns:a="http://schemas.openxmlformats.org/drawingml/2006/main">
+            <a:graphicData uri="http://schemas.openxmlformats.org/drawingml/2006/picture">
+              <pic:pic xmlns:pic="http://schemas.openxmlformats.org/drawingml/2006/picture">
+                <pic:nvPicPr>
+                  <pic:cNvPr id="0" name="obsidian-logo.png"/>
+                  <pic:cNvPicPr/>
+                </pic:nvPicPr>
+                <pic:blipFill>
+                  <a:blip r:embed="rIdLogo"/>
+                  <a:stretch>
+                    <a:fillRect/>
+                  </a:stretch>
+                </pic:blipFill>
+                <pic:spPr>
+                  <a:xfrm>
+                    <a:off x="0" y="0"/>
+                    <a:ext cx="570090" cy="170228"/>
+                  </a:xfrm>
+                  <a:prstGeom prst="rect">
+                    <a:avLst/>
+                  </a:prstGeom>
+                </pic:spPr>
+              </pic:pic>
+            </a:graphicData>
+          </a:graphic>
+        </wp:inline>
+      </w:drawing>
+    </w:r>
     <w:r>
       <w:rPr>
         <w:rFonts w:ascii="Montserrat" w:eastAsia="Montserrat" w:hAnsi="Montserrat"/>

</xml_diff>

<commit_message>
feat: brand the Typst cover; dedupe examples
- html: enable the native title-block banner and render the brand
  mark at its top-left (embedded data URI, so the theme is
  self-contained; positioned absolutely to escape Quarto's banner
  grid). The dark theme hides the dark-on-transparent mark, which
  would vanish on the raised surface; the favicon still brands the
  tab
- revealjs: native logo: bottom-right on every slide
- beamer: native logo: top-right on the title slide
- dashboard: native logo: left in the navigation bar
- docx: add the brand mark to the reference-doc header, left of
  the company name (word/media + drawing + rels + content types)
- verified: logos render in all five formats (visual QA on html
  and docx, xobject check on the beamer PDF, markup checks on
  revealjs and dashboard); classification footline still on every
  beamer slide; LaTeX and Typst regressions pass PDF/A-4f
</commit_message>
<xml_diff>
--- a/_extensions/obsidian/obsidian-reference.docx
+++ b/_extensions/obsidian/obsidian-reference.docx
@@ -496,7 +496,7 @@
 </file>
 
 <file path=word/header1.xml><?xml version="1.0" encoding="utf-8"?>
-<w:hdr xmlns:v="urn:schemas-microsoft-com:vml" xmlns:o="urn:schemas-microsoft-com:office:office" xmlns:w="http://schemas.openxmlformats.org/wordprocessingml/2006/main">
+<w:hdr xmlns:v="urn:schemas-microsoft-com:vml" xmlns:o="urn:schemas-microsoft-com:office:office" xmlns:w="http://schemas.openxmlformats.org/wordprocessingml/2006/main" xmlns:r="http://schemas.openxmlformats.org/officeDocument/2006/relationships" xmlns:wp="http://schemas.openxmlformats.org/drawingml/2006/wordprocessingDrawing" xmlns:a="http://schemas.openxmlformats.org/drawingml/2006/main" xmlns:pic="http://schemas.openxmlformats.org/drawingml/2006/picture">
   <w:p>
     <w:pPr>
       <w:pStyle w:val="Header"/>
@@ -504,6 +504,43 @@
         <w:bottom w:val="single" w:sz="4" w:space="1" w:color="CECECE"/>
       </w:pBdr>
     </w:pPr>
+    <w:r>
+      <w:drawing>
+        <wp:inline distT="0" distB="0" distL="0" distR="0">
+          <wp:extent cx="570090" cy="170228"/>
+          <wp:effectExtent l="0" t="0" r="0" b="0"/>
+          <wp:docPr id="100" name="obsidian-logo.png"/>
+          <wp:cNvGraphicFramePr>
+            <a:graphicFrameLocks xmlns:a="http://schemas.openxmlformats.org/drawingml/2006/main" noChangeAspect="1"/>
+          </wp:cNvGraphicFramePr>
+          <a:graphic xmlns:a="http://schemas.openxmlformats.org/drawingml/2006/main">
+            <a:graphicData uri="http://schemas.openxmlformats.org/drawingml/2006/picture">
+              <pic:pic xmlns:pic="http://schemas.openxmlformats.org/drawingml/2006/picture">
+                <pic:nvPicPr>
+                  <pic:cNvPr id="0" name="obsidian-logo.png"/>
+                  <pic:cNvPicPr/>
+                </pic:nvPicPr>
+                <pic:blipFill>
+                  <a:blip r:embed="rIdLogo"/>
+                  <a:stretch>
+                    <a:fillRect/>
+                  </a:stretch>
+                </pic:blipFill>
+                <pic:spPr>
+                  <a:xfrm>
+                    <a:off x="0" y="0"/>
+                    <a:ext cx="570090" cy="170228"/>
+                  </a:xfrm>
+                  <a:prstGeom prst="rect">
+                    <a:avLst/>
+                  </a:prstGeom>
+                </pic:spPr>
+              </pic:pic>
+            </a:graphicData>
+          </a:graphic>
+        </wp:inline>
+      </w:drawing>
+    </w:r>
     <w:r>
       <w:rPr>
         <w:rFonts w:ascii="Montserrat" w:eastAsia="Montserrat" w:hAnsi="Montserrat"/>

</xml_diff>